<commit_message>
Updated Test Scenario Document
</commit_message>
<xml_diff>
--- a/Test Scenarios/Registration Module Test Scenarios.docx
+++ b/Test Scenarios/Registration Module Test Scenarios.docx
@@ -9,6 +9,8 @@
           <w:rFonts w:ascii="Cambria" w:hAnsi="Cambria"/>
           <w:b/>
           <w:bCs/>
+          <w:sz w:val="32"/>
+          <w:szCs w:val="32"/>
         </w:rPr>
       </w:pPr>
       <w:r>
@@ -16,9 +18,539 @@
           <w:rFonts w:ascii="Cambria" w:hAnsi="Cambria"/>
           <w:b/>
           <w:bCs/>
-        </w:rPr>
-        <w:t>Registration Module Test Scenarios</w:t>
-      </w:r>
+          <w:sz w:val="32"/>
+          <w:szCs w:val="32"/>
+        </w:rPr>
+        <w:t>Test Scenarios Document – Registration/Login Module</w:t>
+      </w:r>
+    </w:p>
+    <w:p>
+      <w:pPr>
+        <w:spacing w:line="240" w:lineRule="auto"/>
+        <w:rPr>
+          <w:rFonts w:ascii="Cambria" w:hAnsi="Cambria"/>
+          <w:sz w:val="24"/>
+          <w:szCs w:val="24"/>
+        </w:rPr>
+      </w:pPr>
+      <w:r>
+        <w:rPr>
+          <w:rFonts w:ascii="Cambria" w:hAnsi="Cambria"/>
+          <w:sz w:val="24"/>
+          <w:szCs w:val="24"/>
+        </w:rPr>
+        <w:t>Example:</w:t>
+      </w:r>
+    </w:p>
+    <w:p>
+      <w:pPr>
+        <w:spacing w:line="240" w:lineRule="auto"/>
+        <w:rPr>
+          <w:rFonts w:ascii="Cambria" w:hAnsi="Cambria"/>
+          <w:sz w:val="24"/>
+          <w:szCs w:val="24"/>
+        </w:rPr>
+      </w:pPr>
+      <w:r>
+        <w:rPr>
+          <w:rFonts w:ascii="Cambria" w:hAnsi="Cambria"/>
+          <w:sz w:val="24"/>
+          <w:szCs w:val="24"/>
+        </w:rPr>
+        <w:t>Project Name: E-Commerce Application</w:t>
+      </w:r>
+    </w:p>
+    <w:p>
+      <w:pPr>
+        <w:spacing w:line="240" w:lineRule="auto"/>
+        <w:rPr>
+          <w:rFonts w:ascii="Cambria" w:hAnsi="Cambria"/>
+          <w:sz w:val="24"/>
+          <w:szCs w:val="24"/>
+        </w:rPr>
+      </w:pPr>
+      <w:r>
+        <w:rPr>
+          <w:rFonts w:ascii="Cambria" w:hAnsi="Cambria"/>
+          <w:sz w:val="24"/>
+          <w:szCs w:val="24"/>
+        </w:rPr>
+        <w:t>Module Name: Registration Module</w:t>
+      </w:r>
+    </w:p>
+    <w:p>
+      <w:pPr>
+        <w:spacing w:line="240" w:lineRule="auto"/>
+        <w:rPr>
+          <w:rFonts w:ascii="Cambria" w:hAnsi="Cambria"/>
+          <w:sz w:val="24"/>
+          <w:szCs w:val="24"/>
+        </w:rPr>
+      </w:pPr>
+      <w:r>
+        <w:rPr>
+          <w:rFonts w:ascii="Cambria" w:hAnsi="Cambria"/>
+          <w:sz w:val="24"/>
+          <w:szCs w:val="24"/>
+        </w:rPr>
+        <w:t>Prepared By: Tushar Potdar</w:t>
+      </w:r>
+    </w:p>
+    <w:p>
+      <w:pPr>
+        <w:spacing w:line="240" w:lineRule="auto"/>
+        <w:rPr>
+          <w:rFonts w:ascii="Cambria" w:hAnsi="Cambria"/>
+          <w:sz w:val="24"/>
+          <w:szCs w:val="24"/>
+        </w:rPr>
+      </w:pPr>
+      <w:r>
+        <w:rPr>
+          <w:rFonts w:ascii="Cambria" w:hAnsi="Cambria"/>
+          <w:sz w:val="24"/>
+          <w:szCs w:val="24"/>
+        </w:rPr>
+        <w:t>Version: 1.0</w:t>
+      </w:r>
+    </w:p>
+    <w:p>
+      <w:pPr>
+        <w:spacing w:line="240" w:lineRule="auto"/>
+        <w:rPr>
+          <w:rFonts w:ascii="Cambria" w:hAnsi="Cambria"/>
+          <w:sz w:val="24"/>
+          <w:szCs w:val="24"/>
+        </w:rPr>
+      </w:pPr>
+    </w:p>
+    <w:p>
+      <w:pPr>
+        <w:spacing w:line="240" w:lineRule="auto"/>
+        <w:rPr>
+          <w:rFonts w:ascii="Cambria" w:hAnsi="Cambria"/>
+          <w:sz w:val="24"/>
+          <w:szCs w:val="24"/>
+        </w:rPr>
+      </w:pPr>
+      <w:r>
+        <w:rPr>
+          <w:rFonts w:ascii="Cambria" w:hAnsi="Cambria"/>
+          <w:sz w:val="24"/>
+          <w:szCs w:val="24"/>
+        </w:rPr>
+        <w:t># Scope of Testing</w:t>
+      </w:r>
+    </w:p>
+    <w:p>
+      <w:pPr>
+        <w:spacing w:line="240" w:lineRule="auto"/>
+        <w:rPr>
+          <w:rFonts w:ascii="Cambria" w:hAnsi="Cambria"/>
+          <w:sz w:val="24"/>
+          <w:szCs w:val="24"/>
+        </w:rPr>
+      </w:pPr>
+    </w:p>
+    <w:p>
+      <w:pPr>
+        <w:spacing w:line="240" w:lineRule="auto"/>
+        <w:rPr>
+          <w:rFonts w:ascii="Cambria" w:hAnsi="Cambria"/>
+          <w:sz w:val="24"/>
+          <w:szCs w:val="24"/>
+        </w:rPr>
+      </w:pPr>
+      <w:r>
+        <w:rPr>
+          <w:rFonts w:ascii="Cambria" w:hAnsi="Cambria"/>
+          <w:sz w:val="24"/>
+          <w:szCs w:val="24"/>
+        </w:rPr>
+        <w:t>The scope of testing for the Registration and Login Modules includes verification of all functionalities related to user account creation, authentication, validation, security, usability, and system behavior. Testing will ensure that the application works correctly according to business and user requirements.</w:t>
+      </w:r>
+    </w:p>
+    <w:p>
+      <w:pPr>
+        <w:spacing w:line="240" w:lineRule="auto"/>
+        <w:rPr>
+          <w:rFonts w:ascii="Cambria" w:hAnsi="Cambria"/>
+          <w:sz w:val="24"/>
+          <w:szCs w:val="24"/>
+        </w:rPr>
+      </w:pPr>
+    </w:p>
+    <w:p>
+      <w:pPr>
+        <w:spacing w:line="240" w:lineRule="auto"/>
+        <w:rPr>
+          <w:rFonts w:ascii="Cambria" w:hAnsi="Cambria"/>
+          <w:sz w:val="24"/>
+          <w:szCs w:val="24"/>
+        </w:rPr>
+      </w:pPr>
+      <w:r>
+        <w:rPr>
+          <w:rFonts w:ascii="Cambria" w:hAnsi="Cambria"/>
+          <w:sz w:val="24"/>
+          <w:szCs w:val="24"/>
+        </w:rPr>
+        <w:t>The testing scope includes the following areas:</w:t>
+      </w:r>
+    </w:p>
+    <w:p>
+      <w:pPr>
+        <w:spacing w:line="240" w:lineRule="auto"/>
+        <w:rPr>
+          <w:rFonts w:ascii="Cambria" w:hAnsi="Cambria"/>
+          <w:sz w:val="24"/>
+          <w:szCs w:val="24"/>
+        </w:rPr>
+      </w:pPr>
+    </w:p>
+    <w:p>
+      <w:pPr>
+        <w:spacing w:line="240" w:lineRule="auto"/>
+        <w:rPr>
+          <w:rFonts w:ascii="Cambria" w:hAnsi="Cambria"/>
+          <w:sz w:val="24"/>
+          <w:szCs w:val="24"/>
+        </w:rPr>
+      </w:pPr>
+      <w:r>
+        <w:rPr>
+          <w:rFonts w:ascii="Cambria" w:hAnsi="Cambria"/>
+          <w:sz w:val="24"/>
+          <w:szCs w:val="24"/>
+        </w:rPr>
+        <w:t>* Verification of Registration and Login page functionality.</w:t>
+      </w:r>
+    </w:p>
+    <w:p>
+      <w:pPr>
+        <w:spacing w:line="240" w:lineRule="auto"/>
+        <w:rPr>
+          <w:rFonts w:ascii="Cambria" w:hAnsi="Cambria"/>
+          <w:sz w:val="24"/>
+          <w:szCs w:val="24"/>
+        </w:rPr>
+      </w:pPr>
+      <w:r>
+        <w:rPr>
+          <w:rFonts w:ascii="Cambria" w:hAnsi="Cambria"/>
+          <w:sz w:val="24"/>
+          <w:szCs w:val="24"/>
+        </w:rPr>
+        <w:t>* Validation of all input fields and mandatory fields.</w:t>
+      </w:r>
+    </w:p>
+    <w:p>
+      <w:pPr>
+        <w:spacing w:line="240" w:lineRule="auto"/>
+        <w:rPr>
+          <w:rFonts w:ascii="Cambria" w:hAnsi="Cambria"/>
+          <w:sz w:val="24"/>
+          <w:szCs w:val="24"/>
+        </w:rPr>
+      </w:pPr>
+      <w:r>
+        <w:rPr>
+          <w:rFonts w:ascii="Cambria" w:hAnsi="Cambria"/>
+          <w:sz w:val="24"/>
+          <w:szCs w:val="24"/>
+        </w:rPr>
+        <w:t>* Verification of successful and unsuccessful user registration and login scenarios.</w:t>
+      </w:r>
+    </w:p>
+    <w:p>
+      <w:pPr>
+        <w:spacing w:line="240" w:lineRule="auto"/>
+        <w:rPr>
+          <w:rFonts w:ascii="Cambria" w:hAnsi="Cambria"/>
+          <w:sz w:val="24"/>
+          <w:szCs w:val="24"/>
+        </w:rPr>
+      </w:pPr>
+      <w:r>
+        <w:rPr>
+          <w:rFonts w:ascii="Cambria" w:hAnsi="Cambria"/>
+          <w:sz w:val="24"/>
+          <w:szCs w:val="24"/>
+        </w:rPr>
+        <w:t>* Validation message verification for invalid inputs.</w:t>
+      </w:r>
+    </w:p>
+    <w:p>
+      <w:pPr>
+        <w:spacing w:line="240" w:lineRule="auto"/>
+        <w:rPr>
+          <w:rFonts w:ascii="Cambria" w:hAnsi="Cambria"/>
+          <w:sz w:val="24"/>
+          <w:szCs w:val="24"/>
+        </w:rPr>
+      </w:pPr>
+      <w:r>
+        <w:rPr>
+          <w:rFonts w:ascii="Cambria" w:hAnsi="Cambria"/>
+          <w:sz w:val="24"/>
+          <w:szCs w:val="24"/>
+        </w:rPr>
+        <w:t>* Password policy and password security validation.</w:t>
+      </w:r>
+    </w:p>
+    <w:p>
+      <w:pPr>
+        <w:spacing w:line="240" w:lineRule="auto"/>
+        <w:rPr>
+          <w:rFonts w:ascii="Cambria" w:hAnsi="Cambria"/>
+          <w:sz w:val="24"/>
+          <w:szCs w:val="24"/>
+        </w:rPr>
+      </w:pPr>
+      <w:r>
+        <w:rPr>
+          <w:rFonts w:ascii="Cambria" w:hAnsi="Cambria"/>
+          <w:sz w:val="24"/>
+          <w:szCs w:val="24"/>
+        </w:rPr>
+        <w:t>* Email and OTP verification functionality testing.</w:t>
+      </w:r>
+    </w:p>
+    <w:p>
+      <w:pPr>
+        <w:spacing w:line="240" w:lineRule="auto"/>
+        <w:rPr>
+          <w:rFonts w:ascii="Cambria" w:hAnsi="Cambria"/>
+          <w:sz w:val="24"/>
+          <w:szCs w:val="24"/>
+        </w:rPr>
+      </w:pPr>
+      <w:r>
+        <w:rPr>
+          <w:rFonts w:ascii="Cambria" w:hAnsi="Cambria"/>
+          <w:sz w:val="24"/>
+          <w:szCs w:val="24"/>
+        </w:rPr>
+        <w:t>* Session management and navigation testing.</w:t>
+      </w:r>
+    </w:p>
+    <w:p>
+      <w:pPr>
+        <w:spacing w:line="240" w:lineRule="auto"/>
+        <w:rPr>
+          <w:rFonts w:ascii="Cambria" w:hAnsi="Cambria"/>
+          <w:sz w:val="24"/>
+          <w:szCs w:val="24"/>
+        </w:rPr>
+      </w:pPr>
+      <w:r>
+        <w:rPr>
+          <w:rFonts w:ascii="Cambria" w:hAnsi="Cambria"/>
+          <w:sz w:val="24"/>
+          <w:szCs w:val="24"/>
+        </w:rPr>
+        <w:t>* Security testing including SQL Injection, XSS, and unauthorized access validation.</w:t>
+      </w:r>
+    </w:p>
+    <w:p>
+      <w:pPr>
+        <w:spacing w:line="240" w:lineRule="auto"/>
+        <w:rPr>
+          <w:rFonts w:ascii="Cambria" w:hAnsi="Cambria"/>
+          <w:sz w:val="24"/>
+          <w:szCs w:val="24"/>
+        </w:rPr>
+      </w:pPr>
+      <w:r>
+        <w:rPr>
+          <w:rFonts w:ascii="Cambria" w:hAnsi="Cambria"/>
+          <w:sz w:val="24"/>
+          <w:szCs w:val="24"/>
+        </w:rPr>
+        <w:t>* Database validation for correct data storage and retrieval.</w:t>
+      </w:r>
+    </w:p>
+    <w:p>
+      <w:pPr>
+        <w:spacing w:line="240" w:lineRule="auto"/>
+        <w:rPr>
+          <w:rFonts w:ascii="Cambria" w:hAnsi="Cambria"/>
+          <w:sz w:val="24"/>
+          <w:szCs w:val="24"/>
+        </w:rPr>
+      </w:pPr>
+      <w:r>
+        <w:rPr>
+          <w:rFonts w:ascii="Cambria" w:hAnsi="Cambria"/>
+          <w:sz w:val="24"/>
+          <w:szCs w:val="24"/>
+        </w:rPr>
+        <w:t>* API testing for registration and login services if APIs are used.</w:t>
+      </w:r>
+    </w:p>
+    <w:p>
+      <w:pPr>
+        <w:spacing w:line="240" w:lineRule="auto"/>
+        <w:rPr>
+          <w:rFonts w:ascii="Cambria" w:hAnsi="Cambria"/>
+          <w:sz w:val="24"/>
+          <w:szCs w:val="24"/>
+        </w:rPr>
+      </w:pPr>
+      <w:r>
+        <w:rPr>
+          <w:rFonts w:ascii="Cambria" w:hAnsi="Cambria"/>
+          <w:sz w:val="24"/>
+          <w:szCs w:val="24"/>
+        </w:rPr>
+        <w:t>* Compatibility testing across different browsers, devices, and operating systems.</w:t>
+      </w:r>
+    </w:p>
+    <w:p>
+      <w:pPr>
+        <w:spacing w:line="240" w:lineRule="auto"/>
+        <w:rPr>
+          <w:rFonts w:ascii="Cambria" w:hAnsi="Cambria"/>
+          <w:sz w:val="24"/>
+          <w:szCs w:val="24"/>
+        </w:rPr>
+      </w:pPr>
+      <w:r>
+        <w:rPr>
+          <w:rFonts w:ascii="Cambria" w:hAnsi="Cambria"/>
+          <w:sz w:val="24"/>
+          <w:szCs w:val="24"/>
+        </w:rPr>
+        <w:t>* Performance testing under multiple user requests and load conditions.</w:t>
+      </w:r>
+    </w:p>
+    <w:p>
+      <w:pPr>
+        <w:spacing w:line="240" w:lineRule="auto"/>
+        <w:rPr>
+          <w:rFonts w:ascii="Cambria" w:hAnsi="Cambria"/>
+          <w:sz w:val="24"/>
+          <w:szCs w:val="24"/>
+        </w:rPr>
+      </w:pPr>
+      <w:r>
+        <w:rPr>
+          <w:rFonts w:ascii="Cambria" w:hAnsi="Cambria"/>
+          <w:sz w:val="24"/>
+          <w:szCs w:val="24"/>
+        </w:rPr>
+        <w:t>* Accessibility testing for keyboard navigation and screen reader support.</w:t>
+      </w:r>
+    </w:p>
+    <w:p>
+      <w:pPr>
+        <w:spacing w:line="240" w:lineRule="auto"/>
+        <w:rPr>
+          <w:rFonts w:ascii="Cambria" w:hAnsi="Cambria"/>
+          <w:sz w:val="24"/>
+          <w:szCs w:val="24"/>
+        </w:rPr>
+      </w:pPr>
+      <w:r>
+        <w:rPr>
+          <w:rFonts w:ascii="Cambria" w:hAnsi="Cambria"/>
+          <w:sz w:val="24"/>
+          <w:szCs w:val="24"/>
+        </w:rPr>
+        <w:t>* Boundary value and input length validation testing.</w:t>
+      </w:r>
+    </w:p>
+    <w:p>
+      <w:pPr>
+        <w:spacing w:line="240" w:lineRule="auto"/>
+        <w:rPr>
+          <w:rFonts w:ascii="Cambria" w:hAnsi="Cambria"/>
+          <w:sz w:val="24"/>
+          <w:szCs w:val="24"/>
+        </w:rPr>
+      </w:pPr>
+      <w:r>
+        <w:rPr>
+          <w:rFonts w:ascii="Cambria" w:hAnsi="Cambria"/>
+          <w:sz w:val="24"/>
+          <w:szCs w:val="24"/>
+        </w:rPr>
+        <w:t>* Usability testing for user-friendly interface and smooth user experience.</w:t>
+      </w:r>
+    </w:p>
+    <w:p>
+      <w:pPr>
+        <w:spacing w:line="240" w:lineRule="auto"/>
+        <w:rPr>
+          <w:rFonts w:ascii="Cambria" w:hAnsi="Cambria"/>
+          <w:sz w:val="24"/>
+          <w:szCs w:val="24"/>
+        </w:rPr>
+      </w:pPr>
+      <w:r>
+        <w:rPr>
+          <w:rFonts w:ascii="Cambria" w:hAnsi="Cambria"/>
+          <w:sz w:val="24"/>
+          <w:szCs w:val="24"/>
+        </w:rPr>
+        <w:t>* Verification of logout functionality and session timeout behavior.</w:t>
+      </w:r>
+    </w:p>
+    <w:p>
+      <w:pPr>
+        <w:spacing w:line="240" w:lineRule="auto"/>
+        <w:rPr>
+          <w:rFonts w:ascii="Cambria" w:hAnsi="Cambria"/>
+          <w:sz w:val="24"/>
+          <w:szCs w:val="24"/>
+        </w:rPr>
+      </w:pPr>
+      <w:r>
+        <w:rPr>
+          <w:rFonts w:ascii="Cambria" w:hAnsi="Cambria"/>
+          <w:sz w:val="24"/>
+          <w:szCs w:val="24"/>
+        </w:rPr>
+        <w:t>* Validation of role-based access control if applicable.</w:t>
+      </w:r>
+    </w:p>
+    <w:p>
+      <w:pPr>
+        <w:spacing w:line="240" w:lineRule="auto"/>
+        <w:rPr>
+          <w:rFonts w:ascii="Cambria" w:hAnsi="Cambria"/>
+          <w:sz w:val="24"/>
+          <w:szCs w:val="24"/>
+        </w:rPr>
+      </w:pPr>
+    </w:p>
+    <w:p>
+      <w:pPr>
+        <w:spacing w:line="240" w:lineRule="auto"/>
+        <w:rPr>
+          <w:rFonts w:ascii="Cambria" w:hAnsi="Cambria"/>
+          <w:sz w:val="24"/>
+          <w:szCs w:val="24"/>
+        </w:rPr>
+      </w:pPr>
+      <w:r>
+        <w:rPr>
+          <w:rFonts w:ascii="Cambria" w:hAnsi="Cambria"/>
+          <w:sz w:val="24"/>
+          <w:szCs w:val="24"/>
+        </w:rPr>
+        <w:t>The testing will be performed in the designated test environment to ensure that the Registration and Login Modules function correctly, securely, reliably, and consistently across supported platforms and user conditions.</w:t>
+      </w:r>
+    </w:p>
+    <w:p>
+      <w:pPr>
+        <w:spacing w:line="240" w:lineRule="auto"/>
+        <w:rPr>
+          <w:rFonts w:ascii="Cambria" w:hAnsi="Cambria"/>
+          <w:sz w:val="24"/>
+          <w:szCs w:val="24"/>
+        </w:rPr>
+      </w:pPr>
     </w:p>
     <w:p>
       <w:pPr>
@@ -230,7 +762,7 @@
           <w:rFonts w:ascii="Cambria" w:hAnsi="Cambria"/>
         </w:rPr>
         <w:pict w14:anchorId="51D4905E">
-          <v:rect id="_x0000_i1253" style="width:0;height:1.5pt" o:hralign="center" o:hrstd="t" o:hr="t" fillcolor="#a0a0a0" stroked="f"/>
+          <v:rect id="_x0000_i1025" style="width:0;height:1.5pt" o:hralign="center" o:hrstd="t" o:hr="t" fillcolor="#a0a0a0" stroked="f"/>
         </w:pict>
       </w:r>
     </w:p>
@@ -426,7 +958,7 @@
           <w:rFonts w:ascii="Cambria" w:hAnsi="Cambria"/>
         </w:rPr>
         <w:pict w14:anchorId="62B33499">
-          <v:rect id="_x0000_i1254" style="width:0;height:1.5pt" o:hralign="center" o:hrstd="t" o:hr="t" fillcolor="#a0a0a0" stroked="f"/>
+          <v:rect id="_x0000_i1026" style="width:0;height:1.5pt" o:hralign="center" o:hrstd="t" o:hr="t" fillcolor="#a0a0a0" stroked="f"/>
         </w:pict>
       </w:r>
     </w:p>
@@ -550,7 +1082,7 @@
           <w:rFonts w:ascii="Cambria" w:hAnsi="Cambria"/>
         </w:rPr>
         <w:pict w14:anchorId="0FF5B23E">
-          <v:rect id="_x0000_i1255" style="width:0;height:1.5pt" o:hralign="center" o:hrstd="t" o:hr="t" fillcolor="#a0a0a0" stroked="f"/>
+          <v:rect id="_x0000_i1027" style="width:0;height:1.5pt" o:hralign="center" o:hrstd="t" o:hr="t" fillcolor="#a0a0a0" stroked="f"/>
         </w:pict>
       </w:r>
     </w:p>
@@ -729,7 +1261,7 @@
           <w:rFonts w:ascii="Cambria" w:hAnsi="Cambria"/>
         </w:rPr>
         <w:pict w14:anchorId="5FC3B423">
-          <v:rect id="_x0000_i1256" style="width:0;height:1.5pt" o:hralign="center" o:hrstd="t" o:hr="t" fillcolor="#a0a0a0" stroked="f"/>
+          <v:rect id="_x0000_i1028" style="width:0;height:1.5pt" o:hralign="center" o:hrstd="t" o:hr="t" fillcolor="#a0a0a0" stroked="f"/>
         </w:pict>
       </w:r>
     </w:p>
@@ -871,7 +1403,7 @@
           <w:rFonts w:ascii="Cambria" w:hAnsi="Cambria"/>
         </w:rPr>
         <w:pict w14:anchorId="71E284B8">
-          <v:rect id="_x0000_i1257" style="width:0;height:1.5pt" o:hralign="center" o:hrstd="t" o:hr="t" fillcolor="#a0a0a0" stroked="f"/>
+          <v:rect id="_x0000_i1029" style="width:0;height:1.5pt" o:hralign="center" o:hrstd="t" o:hr="t" fillcolor="#a0a0a0" stroked="f"/>
         </w:pict>
       </w:r>
     </w:p>
@@ -1085,7 +1617,7 @@
           <w:rFonts w:ascii="Cambria" w:hAnsi="Cambria"/>
         </w:rPr>
         <w:pict w14:anchorId="1A0A772A">
-          <v:rect id="_x0000_i1258" style="width:0;height:1.5pt" o:hralign="center" o:hrstd="t" o:hr="t" fillcolor="#a0a0a0" stroked="f"/>
+          <v:rect id="_x0000_i1030" style="width:0;height:1.5pt" o:hralign="center" o:hrstd="t" o:hr="t" fillcolor="#a0a0a0" stroked="f"/>
         </w:pict>
       </w:r>
     </w:p>
@@ -1173,7 +1705,7 @@
           <w:rFonts w:ascii="Cambria" w:hAnsi="Cambria"/>
         </w:rPr>
         <w:pict w14:anchorId="1E8A4487">
-          <v:rect id="_x0000_i1259" style="width:0;height:1.5pt" o:hralign="center" o:hrstd="t" o:hr="t" fillcolor="#a0a0a0" stroked="f"/>
+          <v:rect id="_x0000_i1031" style="width:0;height:1.5pt" o:hralign="center" o:hrstd="t" o:hr="t" fillcolor="#a0a0a0" stroked="f"/>
         </w:pict>
       </w:r>
     </w:p>
@@ -1316,7 +1848,7 @@
           <w:rFonts w:ascii="Cambria" w:hAnsi="Cambria"/>
         </w:rPr>
         <w:pict w14:anchorId="3973A059">
-          <v:rect id="_x0000_i1260" style="width:0;height:1.5pt" o:hralign="center" o:hrstd="t" o:hr="t" fillcolor="#a0a0a0" stroked="f"/>
+          <v:rect id="_x0000_i1032" style="width:0;height:1.5pt" o:hralign="center" o:hrstd="t" o:hr="t" fillcolor="#a0a0a0" stroked="f"/>
         </w:pict>
       </w:r>
     </w:p>
@@ -1422,7 +1954,7 @@
           <w:rFonts w:ascii="Cambria" w:hAnsi="Cambria"/>
         </w:rPr>
         <w:pict w14:anchorId="23DB3DBE">
-          <v:rect id="_x0000_i1261" style="width:0;height:1.5pt" o:hralign="center" o:hrstd="t" o:hr="t" fillcolor="#a0a0a0" stroked="f"/>
+          <v:rect id="_x0000_i1033" style="width:0;height:1.5pt" o:hralign="center" o:hrstd="t" o:hr="t" fillcolor="#a0a0a0" stroked="f"/>
         </w:pict>
       </w:r>
     </w:p>
@@ -1492,7 +2024,7 @@
           <w:rFonts w:ascii="Cambria" w:hAnsi="Cambria"/>
         </w:rPr>
         <w:pict w14:anchorId="2CDC5979">
-          <v:rect id="_x0000_i1262" style="width:0;height:1.5pt" o:hralign="center" o:hrstd="t" o:hr="t" fillcolor="#a0a0a0" stroked="f"/>
+          <v:rect id="_x0000_i1034" style="width:0;height:1.5pt" o:hralign="center" o:hrstd="t" o:hr="t" fillcolor="#a0a0a0" stroked="f"/>
         </w:pict>
       </w:r>
     </w:p>
@@ -1580,7 +2112,7 @@
           <w:rFonts w:ascii="Cambria" w:hAnsi="Cambria"/>
         </w:rPr>
         <w:pict w14:anchorId="1C613A52">
-          <v:rect id="_x0000_i1263" style="width:0;height:1.5pt" o:hralign="center" o:hrstd="t" o:hr="t" fillcolor="#a0a0a0" stroked="f"/>
+          <v:rect id="_x0000_i1035" style="width:0;height:1.5pt" o:hralign="center" o:hrstd="t" o:hr="t" fillcolor="#a0a0a0" stroked="f"/>
         </w:pict>
       </w:r>
     </w:p>
@@ -1668,7 +2200,7 @@
           <w:rFonts w:ascii="Cambria" w:hAnsi="Cambria"/>
         </w:rPr>
         <w:pict w14:anchorId="59071A94">
-          <v:rect id="_x0000_i1264" style="width:0;height:1.5pt" o:hralign="center" o:hrstd="t" o:hr="t" fillcolor="#a0a0a0" stroked="f"/>
+          <v:rect id="_x0000_i1036" style="width:0;height:1.5pt" o:hralign="center" o:hrstd="t" o:hr="t" fillcolor="#a0a0a0" stroked="f"/>
         </w:pict>
       </w:r>
     </w:p>
@@ -13900,6 +14432,7 @@
   <w:style w:type="character" w:default="1" w:styleId="DefaultParagraphFont">
     <w:name w:val="Default Paragraph Font"/>
     <w:uiPriority w:val="1"/>
+    <w:semiHidden/>
     <w:unhideWhenUsed/>
   </w:style>
   <w:style w:type="table" w:default="1" w:styleId="TableNormal">

</xml_diff>